<commit_message>
fix: đồng bộ số liệu report/README với git thật
- report.docx §8: 72 commit (CapyCoder 15), không còn 71/14
- test count: 407 passed (full suite) / 403 qua `make test`
- logs/README: bỏ dẫn thư mục staging_20261018_034302 không tồn tại
- FIX_TASKS: bỏ T5 đã xong, sửa số test cũ
- eval/run_eval: in "VALIDATE ONLY" thay cho "DRY RUN"
</commit_message>
<xml_diff>
--- a/report.docx
+++ b/report.docx
@@ -28,7 +28,7 @@
         </w:rPr>
         <w:t>Báo cáo Final Project AIPR · RAG + Agent loop + MCP có đo lường</w:t>
         <w:br/>
-        <w:t>Nhóm 3 sinh viên · commit 68a7a22 · 2026-10-17</w:t>
+        <w:t>Nhóm 3 sinh viên · commit ebf52c5 · 2026-10-17</w:t>
       </w:r>
     </w:p>
     <w:p>
@@ -8120,7 +8120,7 @@
           <w:i w:val="0"/>
           <w:sz w:val="20"/>
         </w:rPr>
-        <w:t>Đã xác minh bằng log hoặc bằng lần chạy lại trong phiên này: bộ unit test đạt 403 passed, 0 skipped trên Python 3.13.5; semantic gate trả overall = PASS với 12/12 ca, 0 schema error, 0 semantic error, 0 unverified check; và cặp write → read-back của q05 có mặt trong step_events.jsonl. Chưa xác minh và báo cáo không claim: model/provider của lần chạy (log không lưu trường này — qwen/qwen3.8-27b trong llm.py:24 chỉ là default trong code), điểm faithfulness (Unscorable 12/12 vì runtime không sinh claims), và phép đo judge (log được tạo trước khi module judge ra đời).</w:t>
+        <w:t>Đã xác minh bằng log hoặc bằng lần chạy lại trong phiên này: bộ unit test đạt 407 passed, 0 skipped trên Python 3.13.5 (target `make test` loại `tests/test_tools.py` nên báo 403); semantic gate trả overall = PASS với 12/12 ca, 0 schema error, 0 semantic error, 0 unverified check; và cặp write → read-back của q05 có mặt trong step_events.jsonl. Chưa xác minh và báo cáo không claim: model/provider của lần chạy (log không lưu trường này — qwen/qwen3.8-27b trong llm.py:24 chỉ là default trong code), điểm faithfulness (Unscorable 12/12 vì runtime không sinh claims), và phép đo judge (log được tạo trước khi module judge ra đời).</w:t>
       </w:r>
     </w:p>
     <w:p>
@@ -8688,7 +8688,7 @@
               <w:rPr>
                 <w:sz w:val="17"/>
               </w:rPr>
-              <w:t>14</w:t>
+              <w:t>15</w:t>
             </w:r>
           </w:p>
         </w:tc>
@@ -8798,7 +8798,7 @@
               <w:rPr>
                 <w:sz w:val="17"/>
               </w:rPr>
-              <w:t>71</w:t>
+              <w:t>72</w:t>
             </w:r>
           </w:p>
         </w:tc>
@@ -8984,7 +8984,7 @@
           <w:i/>
           <w:sz w:val="17"/>
         </w:rPr>
-        <w:t>Commit HEAD tại thời điểm đóng gói báo cáo: 68a7a22.</w:t>
+        <w:t>Commit HEAD tại thời điểm đóng gói báo cáo: ebf52c5.</w:t>
       </w:r>
     </w:p>
     <w:p>

</xml_diff>